<commit_message>
Adapt skill for Russian patent applications
</commit_message>
<xml_diff>
--- a/examples/example_batch_job_scheduler/knowledge/docs/sample_architecture_review.docx
+++ b/examples/example_batch_job_scheduler/knowledge/docs/sample_architecture_review.docx
@@ -4,40 +4,217 @@
   <w:body>
     <w:p>
       <w:pPr>
-        <w:pStyle w:val="Title"/>
+        <w:pStyle w:val="Heading1"/>
       </w:pPr>
       <w:r>
-        <w:t>批任务调度架构纪要（示例 Word）</w:t>
+        <w:t>Заметки архитектурного обзора</w:t>
       </w:r>
     </w:p>
     <w:p>
       <w:r>
-        <w:t>本文档为专利技能示例用虚构材料，与 Markdown 版 architecture.md 口径一致，用于测试 docx → Markdown 与内嵌图片抽取。</w:t>
+        <w:t>Вымышленный документ для проверки Office-to-Markdown конвертации в patent-ru-skill.</w:t>
       </w:r>
     </w:p>
     <w:p>
       <w:pPr>
-        <w:pStyle w:val="Heading1"/>
+        <w:pStyle w:val="Heading2"/>
       </w:pPr>
       <w:r>
-        <w:t>1. 总体结构</w:t>
+        <w:t>Технический контекст</w:t>
       </w:r>
     </w:p>
     <w:p>
+      <w:pPr>
+        <w:pStyle w:val="ListBullet"/>
+      </w:pPr>
       <w:r>
-        <w:t>调度器维护全局队列；工作节点上报 CPU/内存/IO；配置中心提供优先级与阈值。</w:t>
+        <w:t>Планировщик ведет глобальную очередь ожидающих пакетных задач.</w:t>
       </w:r>
     </w:p>
     <w:p>
+      <w:pPr>
+        <w:pStyle w:val="ListBullet"/>
+      </w:pPr>
       <w:r>
-        <w:t>下图为模块关系示意（示例配图，非真实架构图）。</w:t>
+        <w:t>Рабочие узлы передают метрики CPU, памяти и I/O через периодический heartbeat.</w:t>
+      </w:r>
+    </w:p>
+    <w:p>
+      <w:pPr>
+        <w:pStyle w:val="ListBullet"/>
+      </w:pPr>
+      <w:r>
+        <w:t>Score соответствия объединяет вектор требований задачи и ресурсный профиль узла.</w:t>
+      </w:r>
+    </w:p>
+    <w:p>
+      <w:pPr>
+        <w:pStyle w:val="ListBullet"/>
+      </w:pPr>
+      <w:r>
+        <w:t>Переупорядочивание ограничено по времени, чтобы снизить колебания очереди.</w:t>
+      </w:r>
+    </w:p>
+    <w:p>
+      <w:pPr>
+        <w:pStyle w:val="Heading2"/>
+      </w:pPr>
+      <w:r>
+        <w:t>Признаки, потенциально важные для заявки</w:t>
+      </w:r>
+    </w:p>
+    <w:tbl>
+      <w:tblPr>
+        <w:tblW w:type="auto" w:w="0"/>
+        <w:tblLook w:firstColumn="1" w:firstRow="1" w:lastColumn="0" w:lastRow="0" w:noHBand="0" w:noVBand="1" w:val="04A0"/>
+      </w:tblPr>
+      <w:tblGrid>
+        <w:gridCol w:w="2880"/>
+        <w:gridCol w:w="2880"/>
+        <w:gridCol w:w="2880"/>
+      </w:tblGrid>
+      <w:tr>
+        <w:tc>
+          <w:tcPr>
+            <w:tcW w:type="dxa" w:w="2880"/>
+          </w:tcPr>
+          <w:p>
+            <w:r>
+              <w:t>Признак</w:t>
+            </w:r>
+          </w:p>
+        </w:tc>
+        <w:tc>
+          <w:tcPr>
+            <w:tcW w:type="dxa" w:w="2880"/>
+          </w:tcPr>
+          <w:p>
+            <w:r>
+              <w:t>Назначение</w:t>
+            </w:r>
+          </w:p>
+        </w:tc>
+        <w:tc>
+          <w:tcPr>
+            <w:tcW w:type="dxa" w:w="2880"/>
+          </w:tcPr>
+          <w:p>
+            <w:r>
+              <w:t>Возможный технический результат</w:t>
+            </w:r>
+          </w:p>
+        </w:tc>
+      </w:tr>
+      <w:tr>
+        <w:tc>
+          <w:tcPr>
+            <w:tcW w:type="dxa" w:w="2880"/>
+          </w:tcPr>
+          <w:p>
+            <w:r>
+              <w:t>Агрегация ресурсных профилей</w:t>
+            </w:r>
+          </w:p>
+        </w:tc>
+        <w:tc>
+          <w:tcPr>
+            <w:tcW w:type="dxa" w:w="2880"/>
+          </w:tcPr>
+          <w:p>
+            <w:r>
+              <w:t>Сглаживает метрики узлов в окне времени</w:t>
+            </w:r>
+          </w:p>
+        </w:tc>
+        <w:tc>
+          <w:tcPr>
+            <w:tcW w:type="dxa" w:w="2880"/>
+          </w:tcPr>
+          <w:p>
+            <w:r>
+              <w:t>Более стабильные решения планировщика</w:t>
+            </w:r>
+          </w:p>
+        </w:tc>
+      </w:tr>
+      <w:tr>
+        <w:tc>
+          <w:tcPr>
+            <w:tcW w:type="dxa" w:w="2880"/>
+          </w:tcPr>
+          <w:p>
+            <w:r>
+              <w:t>Score соответствия</w:t>
+            </w:r>
+          </w:p>
+        </w:tc>
+        <w:tc>
+          <w:tcPr>
+            <w:tcW w:type="dxa" w:w="2880"/>
+          </w:tcPr>
+          <w:p>
+            <w:r>
+              <w:t>Сопоставляет требования задачи и состояние узла до отправки</w:t>
+            </w:r>
+          </w:p>
+        </w:tc>
+        <w:tc>
+          <w:tcPr>
+            <w:tcW w:type="dxa" w:w="2880"/>
+          </w:tcPr>
+          <w:p>
+            <w:r>
+              <w:t>Меньше ресурсных несоответствий</w:t>
+            </w:r>
+          </w:p>
+        </w:tc>
+      </w:tr>
+      <w:tr>
+        <w:tc>
+          <w:tcPr>
+            <w:tcW w:type="dxa" w:w="2880"/>
+          </w:tcPr>
+          <w:p>
+            <w:r>
+              <w:t>Ограниченное переупорядочивание</w:t>
+            </w:r>
+          </w:p>
+        </w:tc>
+        <w:tc>
+          <w:tcPr>
+            <w:tcW w:type="dxa" w:w="2880"/>
+          </w:tcPr>
+          <w:p>
+            <w:r>
+              <w:t>Изменяет очередь только при выполнении порогов</w:t>
+            </w:r>
+          </w:p>
+        </w:tc>
+        <w:tc>
+          <w:tcPr>
+            <w:tcW w:type="dxa" w:w="2880"/>
+          </w:tcPr>
+          <w:p>
+            <w:r>
+              <w:t>Снижение колебаний очереди</w:t>
+            </w:r>
+          </w:p>
+        </w:tc>
+      </w:tr>
+    </w:tbl>
+    <w:p>
+      <w:pPr>
+        <w:pStyle w:val="Heading2"/>
+      </w:pPr>
+      <w:r>
+        <w:t>Схема модулей</w:t>
       </w:r>
     </w:p>
     <w:p>
       <w:r>
         <w:drawing>
           <wp:inline xmlns:a="http://schemas.openxmlformats.org/drawingml/2006/main" xmlns:pic="http://schemas.openxmlformats.org/drawingml/2006/picture">
-            <wp:extent cx="5303520" cy="2983230"/>
+            <wp:extent cx="4114800" cy="2314575"/>
             <wp:docPr id="1" name="Picture 1"/>
             <wp:cNvGraphicFramePr>
               <a:graphicFrameLocks noChangeAspect="1"/>
@@ -58,7 +235,7 @@
                   <pic:spPr>
                     <a:xfrm>
                       <a:off x="0" y="0"/>
-                      <a:ext cx="5303520" cy="2983230"/>
+                      <a:ext cx="4114800" cy="2314575"/>
                     </a:xfrm>
                     <a:prstGeom prst="rect"/>
                   </pic:spPr>
@@ -71,27 +248,17 @@
     </w:p>
     <w:p>
       <w:pPr>
-        <w:pStyle w:val="Heading1"/>
+        <w:pStyle w:val="Heading2"/>
       </w:pPr>
       <w:r>
-        <w:t>2. 痛点与目标</w:t>
-      </w:r>
-    </w:p>
-    <w:p>
-      <w:r>
-        <w:t>异构集群下大任务占满高性能节点、小任务长尾等待；目标为降低饥饿、可接受分钟级调度、限频重排。</w:t>
-      </w:r>
-    </w:p>
-    <w:p>
-      <w:r>
-        <w:t>队列与异构节点示意：</w:t>
+        <w:t>Схема очереди</w:t>
       </w:r>
     </w:p>
     <w:p>
       <w:r>
         <w:drawing>
           <wp:inline xmlns:a="http://schemas.openxmlformats.org/drawingml/2006/main" xmlns:pic="http://schemas.openxmlformats.org/drawingml/2006/picture">
-            <wp:extent cx="5303520" cy="2983230"/>
+            <wp:extent cx="4114800" cy="2314575"/>
             <wp:docPr id="2" name="Picture 2"/>
             <wp:cNvGraphicFramePr>
               <a:graphicFrameLocks noChangeAspect="1"/>
@@ -112,7 +279,7 @@
                   <pic:spPr>
                     <a:xfrm>
                       <a:off x="0" y="0"/>
-                      <a:ext cx="5303520" cy="2983230"/>
+                      <a:ext cx="4114800" cy="2314575"/>
                     </a:xfrm>
                     <a:prstGeom prst="rect"/>
                   </pic:spPr>
@@ -121,19 +288,6 @@
             </a:graphic>
           </wp:inline>
         </w:drawing>
-      </w:r>
-    </w:p>
-    <w:p>
-      <w:pPr>
-        <w:pStyle w:val="Heading1"/>
-      </w:pPr>
-      <w:r>
-        <w:t>3. 模块对照</w:t>
-      </w:r>
-    </w:p>
-    <w:p>
-      <w:r>
-        <w:t>资源画像聚合、匹配打分、限频重排队、派发、心跳契约 — 详见同目录 architecture.md 表格。</w:t>
       </w:r>
     </w:p>
     <w:sectPr>
@@ -24045,8 +24199,8 @@
         <a:cs typeface=""/>
         <a:font script="Jpan" typeface="ＭＳ ゴシック"/>
         <a:font script="Hang" typeface="맑은 고딕"/>
-        <a:font script="Hans" typeface="宋体"/>
-        <a:font script="Hant" typeface="新細明體"/>
+        <a:font script="Hans" typeface="Arial"/>
+        <a:font script="Hant" typeface="Arial"/>
         <a:font script="Arab" typeface="Times New Roman"/>
         <a:font script="Hebr" typeface="Times New Roman"/>
         <a:font script="Thai" typeface="Angsana New"/>
@@ -24078,10 +24232,10 @@
         <a:latin typeface="Cambria"/>
         <a:ea typeface=""/>
         <a:cs typeface=""/>
-        <a:font script="Jpan" typeface="ＭＳ 明朝"/>
+        <a:font script="Jpan" typeface="MS Mincho"/>
         <a:font script="Hang" typeface="맑은 고딕"/>
-        <a:font script="Hans" typeface="宋体"/>
-        <a:font script="Hant" typeface="新細明體"/>
+        <a:font script="Hans" typeface="Arial"/>
+        <a:font script="Hant" typeface="Arial"/>
         <a:font script="Arab" typeface="Arial"/>
         <a:font script="Hebr" typeface="Arial"/>
         <a:font script="Thai" typeface="Cordia New"/>

</xml_diff>